<commit_message>
fix: wrap useSearchParams in Suspense to fix Vercel prerendering error and update deps/assets
</commit_message>
<xml_diff>
--- a/Questions/Class 6/Sample.docx
+++ b/Questions/Class 6/Sample.docx
@@ -4,7 +4,7 @@
   <w:body>
     <w:p>
       <w:pPr>
-        <w:pStyle w:val="NormalWeb"/>
+        <w:pStyle w:val="NoSpacing"/>
       </w:pPr>
       <w:r>
         <w:t>Question: How many generations can computer languages be classified into?</w:t>
@@ -12,7 +12,7 @@
     </w:p>
     <w:p>
       <w:pPr>
-        <w:pStyle w:val="NormalWeb"/>
+        <w:pStyle w:val="NoSpacing"/>
       </w:pPr>
       <w:r>
         <w:t xml:space="preserve">Type: </w:t>
@@ -25,7 +25,7 @@
     </w:p>
     <w:p>
       <w:pPr>
-        <w:pStyle w:val="NormalWeb"/>
+        <w:pStyle w:val="NoSpacing"/>
       </w:pPr>
       <w:r>
         <w:t>A) Two</w:t>
@@ -33,7 +33,7 @@
     </w:p>
     <w:p>
       <w:pPr>
-        <w:pStyle w:val="NormalWeb"/>
+        <w:pStyle w:val="NoSpacing"/>
       </w:pPr>
       <w:r>
         <w:t>B) Four</w:t>
@@ -41,7 +41,7 @@
     </w:p>
     <w:p>
       <w:pPr>
-        <w:pStyle w:val="NormalWeb"/>
+        <w:pStyle w:val="NoSpacing"/>
       </w:pPr>
       <w:r>
         <w:t>C) Five</w:t>
@@ -49,7 +49,7 @@
     </w:p>
     <w:p>
       <w:pPr>
-        <w:pStyle w:val="NormalWeb"/>
+        <w:pStyle w:val="NoSpacing"/>
       </w:pPr>
       <w:r>
         <w:t>D) Six</w:t>
@@ -57,7 +57,7 @@
     </w:p>
     <w:p>
       <w:pPr>
-        <w:pStyle w:val="NormalWeb"/>
+        <w:pStyle w:val="NoSpacing"/>
       </w:pPr>
       <w:r>
         <w:t>Answer: C</w:t>
@@ -65,7 +65,7 @@
     </w:p>
     <w:p>
       <w:pPr>
-        <w:pStyle w:val="NormalWeb"/>
+        <w:pStyle w:val="NoSpacing"/>
       </w:pPr>
       <w:r>
         <w:t>Question: ______ language is the only language that a computer directly understands.</w:t>
@@ -73,7 +73,7 @@
     </w:p>
     <w:p>
       <w:pPr>
-        <w:pStyle w:val="NormalWeb"/>
+        <w:pStyle w:val="NoSpacing"/>
       </w:pPr>
       <w:r>
         <w:t>Type: fill</w:t>
@@ -81,7 +81,7 @@
     </w:p>
     <w:p>
       <w:pPr>
-        <w:pStyle w:val="NormalWeb"/>
+        <w:pStyle w:val="NoSpacing"/>
       </w:pPr>
       <w:r>
         <w:t>Answer: Machine</w:t>
@@ -89,7 +89,7 @@
     </w:p>
     <w:p>
       <w:pPr>
-        <w:pStyle w:val="NormalWeb"/>
+        <w:pStyle w:val="NoSpacing"/>
       </w:pPr>
       <w:r>
         <w:t>Question: Unscramble the letters to form the name of a language processor.</w:t>
@@ -97,7 +97,7 @@
     </w:p>
     <w:p>
       <w:pPr>
-        <w:pStyle w:val="NormalWeb"/>
+        <w:pStyle w:val="NoSpacing"/>
       </w:pPr>
       <w:r>
         <w:t>Type: jumbled</w:t>
@@ -105,7 +105,7 @@
     </w:p>
     <w:p>
       <w:pPr>
-        <w:pStyle w:val="NormalWeb"/>
+        <w:pStyle w:val="NoSpacing"/>
       </w:pPr>
       <w:r>
         <w:t>Answer: compiler</w:t>
@@ -113,7 +113,7 @@
     </w:p>
     <w:p>
       <w:pPr>
-        <w:pStyle w:val="NormalWeb"/>
+        <w:pStyle w:val="NoSpacing"/>
       </w:pPr>
       <w:r>
         <w:t>Question: Match the computer languages to their respective generation categories.</w:t>
@@ -121,7 +121,7 @@
     </w:p>
     <w:p>
       <w:pPr>
-        <w:pStyle w:val="NormalWeb"/>
+        <w:pStyle w:val="NoSpacing"/>
       </w:pPr>
       <w:r>
         <w:t>Type: match</w:t>
@@ -129,7 +129,7 @@
     </w:p>
     <w:p>
       <w:pPr>
-        <w:pStyle w:val="NormalWeb"/>
+        <w:pStyle w:val="NoSpacing"/>
       </w:pPr>
       <w:r>
         <w:t xml:space="preserve">Answer: </w:t>
@@ -137,7 +137,7 @@
     </w:p>
     <w:p>
       <w:pPr>
-        <w:pStyle w:val="NormalWeb"/>
+        <w:pStyle w:val="NoSpacing"/>
       </w:pPr>
       <w:r>
         <w:t xml:space="preserve">Machine </w:t>
@@ -153,7 +153,7 @@
     </w:p>
     <w:p>
       <w:pPr>
-        <w:pStyle w:val="NormalWeb"/>
+        <w:pStyle w:val="NoSpacing"/>
       </w:pPr>
       <w:r>
         <w:t xml:space="preserve">Assembly </w:t>
@@ -169,7 +169,7 @@
     </w:p>
     <w:p>
       <w:pPr>
-        <w:pStyle w:val="NormalWeb"/>
+        <w:pStyle w:val="NoSpacing"/>
       </w:pPr>
       <w:proofErr w:type="gramStart"/>
       <w:r>
@@ -182,7 +182,7 @@
     </w:p>
     <w:p>
       <w:pPr>
-        <w:pStyle w:val="NormalWeb"/>
+        <w:pStyle w:val="NoSpacing"/>
       </w:pPr>
       <w:proofErr w:type="gramStart"/>
       <w:r>
@@ -195,7 +195,7 @@
     </w:p>
     <w:p>
       <w:pPr>
-        <w:pStyle w:val="NormalWeb"/>
+        <w:pStyle w:val="NoSpacing"/>
       </w:pPr>
       <w:r>
         <w:t>OPS</w:t>
@@ -211,7 +211,7 @@
     </w:p>
     <w:p>
       <w:pPr>
-        <w:pStyle w:val="NormalWeb"/>
+        <w:pStyle w:val="NoSpacing"/>
       </w:pPr>
       <w:r>
         <w:t>Question: The development of computer languages is classified into two categories.</w:t>
@@ -219,7 +219,7 @@
     </w:p>
     <w:p>
       <w:pPr>
-        <w:pStyle w:val="NormalWeb"/>
+        <w:pStyle w:val="NoSpacing"/>
       </w:pPr>
       <w:r>
         <w:t xml:space="preserve">Type: </w:t>
@@ -232,7 +232,7 @@
     </w:p>
     <w:p>
       <w:pPr>
-        <w:pStyle w:val="NormalWeb"/>
+        <w:pStyle w:val="NoSpacing"/>
       </w:pPr>
       <w:r>
         <w:t>Answer: false</w:t>
@@ -692,6 +692,15 @@
       <w:lang w:eastAsia="en-IN" w:bidi="hi-IN"/>
     </w:rPr>
   </w:style>
+  <w:style w:type="paragraph" w:styleId="NoSpacing">
+    <w:name w:val="No Spacing"/>
+    <w:uiPriority w:val="1"/>
+    <w:qFormat/>
+    <w:rsid w:val="006D6D12"/>
+    <w:pPr>
+      <w:spacing w:after="0" w:line="240" w:lineRule="auto"/>
+    </w:pPr>
+  </w:style>
 </w:styles>
 </file>
 

</xml_diff>

<commit_message>
Implement student-teacher messaging system with unread notifications and modern UI
</commit_message>
<xml_diff>
--- a/Questions/Class 6/Sample.docx
+++ b/Questions/Class 6/Sample.docx
@@ -5,6 +5,7 @@
     <w:p>
       <w:pPr>
         <w:pStyle w:val="NoSpacing"/>
+        <w:spacing w:line="480" w:lineRule="auto"/>
       </w:pPr>
       <w:r>
         <w:t>Question: How many generations can computer languages be classified into?</w:t>
@@ -13,6 +14,7 @@
     <w:p>
       <w:pPr>
         <w:pStyle w:val="NoSpacing"/>
+        <w:spacing w:line="480" w:lineRule="auto"/>
       </w:pPr>
       <w:r>
         <w:t xml:space="preserve">Type: </w:t>
@@ -26,6 +28,7 @@
     <w:p>
       <w:pPr>
         <w:pStyle w:val="NoSpacing"/>
+        <w:spacing w:line="480" w:lineRule="auto"/>
       </w:pPr>
       <w:r>
         <w:t>A) Two</w:t>
@@ -34,6 +37,7 @@
     <w:p>
       <w:pPr>
         <w:pStyle w:val="NoSpacing"/>
+        <w:spacing w:line="480" w:lineRule="auto"/>
       </w:pPr>
       <w:r>
         <w:t>B) Four</w:t>
@@ -42,6 +46,7 @@
     <w:p>
       <w:pPr>
         <w:pStyle w:val="NoSpacing"/>
+        <w:spacing w:line="480" w:lineRule="auto"/>
       </w:pPr>
       <w:r>
         <w:t>C) Five</w:t>
@@ -50,6 +55,7 @@
     <w:p>
       <w:pPr>
         <w:pStyle w:val="NoSpacing"/>
+        <w:spacing w:line="480" w:lineRule="auto"/>
       </w:pPr>
       <w:r>
         <w:t>D) Six</w:t>
@@ -58,6 +64,7 @@
     <w:p>
       <w:pPr>
         <w:pStyle w:val="NoSpacing"/>
+        <w:spacing w:line="480" w:lineRule="auto"/>
       </w:pPr>
       <w:r>
         <w:t>Answer: C</w:t>
@@ -66,6 +73,7 @@
     <w:p>
       <w:pPr>
         <w:pStyle w:val="NoSpacing"/>
+        <w:spacing w:line="480" w:lineRule="auto"/>
       </w:pPr>
       <w:r>
         <w:t>Question: ______ language is the only language that a computer directly understands.</w:t>
@@ -74,6 +82,7 @@
     <w:p>
       <w:pPr>
         <w:pStyle w:val="NoSpacing"/>
+        <w:spacing w:line="480" w:lineRule="auto"/>
       </w:pPr>
       <w:r>
         <w:t>Type: fill</w:t>
@@ -82,6 +91,7 @@
     <w:p>
       <w:pPr>
         <w:pStyle w:val="NoSpacing"/>
+        <w:spacing w:line="480" w:lineRule="auto"/>
       </w:pPr>
       <w:r>
         <w:t>Answer: Machine</w:t>
@@ -90,6 +100,7 @@
     <w:p>
       <w:pPr>
         <w:pStyle w:val="NoSpacing"/>
+        <w:spacing w:line="480" w:lineRule="auto"/>
       </w:pPr>
       <w:r>
         <w:t>Question: Unscramble the letters to form the name of a language processor.</w:t>
@@ -98,6 +109,7 @@
     <w:p>
       <w:pPr>
         <w:pStyle w:val="NoSpacing"/>
+        <w:spacing w:line="480" w:lineRule="auto"/>
       </w:pPr>
       <w:r>
         <w:t>Type: jumbled</w:t>
@@ -106,6 +118,7 @@
     <w:p>
       <w:pPr>
         <w:pStyle w:val="NoSpacing"/>
+        <w:spacing w:line="480" w:lineRule="auto"/>
       </w:pPr>
       <w:r>
         <w:t>Answer: compiler</w:t>
@@ -114,6 +127,7 @@
     <w:p>
       <w:pPr>
         <w:pStyle w:val="NoSpacing"/>
+        <w:spacing w:line="480" w:lineRule="auto"/>
       </w:pPr>
       <w:r>
         <w:t>Question: Match the computer languages to their respective generation categories.</w:t>
@@ -122,6 +136,7 @@
     <w:p>
       <w:pPr>
         <w:pStyle w:val="NoSpacing"/>
+        <w:spacing w:line="480" w:lineRule="auto"/>
       </w:pPr>
       <w:r>
         <w:t>Type: match</w:t>
@@ -130,6 +145,7 @@
     <w:p>
       <w:pPr>
         <w:pStyle w:val="NoSpacing"/>
+        <w:spacing w:line="480" w:lineRule="auto"/>
       </w:pPr>
       <w:r>
         <w:t xml:space="preserve">Answer: </w:t>
@@ -138,6 +154,7 @@
     <w:p>
       <w:pPr>
         <w:pStyle w:val="NoSpacing"/>
+        <w:spacing w:line="480" w:lineRule="auto"/>
       </w:pPr>
       <w:r>
         <w:t xml:space="preserve">Machine </w:t>
@@ -154,6 +171,7 @@
     <w:p>
       <w:pPr>
         <w:pStyle w:val="NoSpacing"/>
+        <w:spacing w:line="480" w:lineRule="auto"/>
       </w:pPr>
       <w:r>
         <w:t xml:space="preserve">Assembly </w:t>
@@ -170,6 +188,7 @@
     <w:p>
       <w:pPr>
         <w:pStyle w:val="NoSpacing"/>
+        <w:spacing w:line="480" w:lineRule="auto"/>
       </w:pPr>
       <w:proofErr w:type="gramStart"/>
       <w:r>
@@ -183,6 +202,7 @@
     <w:p>
       <w:pPr>
         <w:pStyle w:val="NoSpacing"/>
+        <w:spacing w:line="480" w:lineRule="auto"/>
       </w:pPr>
       <w:proofErr w:type="gramStart"/>
       <w:r>
@@ -196,6 +216,7 @@
     <w:p>
       <w:pPr>
         <w:pStyle w:val="NoSpacing"/>
+        <w:spacing w:line="480" w:lineRule="auto"/>
       </w:pPr>
       <w:r>
         <w:t>OPS</w:t>
@@ -212,6 +233,7 @@
     <w:p>
       <w:pPr>
         <w:pStyle w:val="NoSpacing"/>
+        <w:spacing w:line="480" w:lineRule="auto"/>
       </w:pPr>
       <w:r>
         <w:t>Question: The development of computer languages is classified into two categories.</w:t>
@@ -220,6 +242,7 @@
     <w:p>
       <w:pPr>
         <w:pStyle w:val="NoSpacing"/>
+        <w:spacing w:line="480" w:lineRule="auto"/>
       </w:pPr>
       <w:r>
         <w:t xml:space="preserve">Type: </w:t>
@@ -233,6 +256,7 @@
     <w:p>
       <w:pPr>
         <w:pStyle w:val="NoSpacing"/>
+        <w:spacing w:line="480" w:lineRule="auto"/>
       </w:pPr>
       <w:r>
         <w:t>Answer: false</w:t>

</xml_diff>

<commit_message>
allow editing test details after creation and rename action button
</commit_message>
<xml_diff>
--- a/Questions/Class 6/Sample.docx
+++ b/Questions/Class 6/Sample.docx
@@ -5,7 +5,6 @@
     <w:p>
       <w:pPr>
         <w:pStyle w:val="NoSpacing"/>
-        <w:spacing w:line="480" w:lineRule="auto"/>
       </w:pPr>
       <w:r>
         <w:t>Question: How many generations can computer languages be classified into?</w:t>
@@ -14,7 +13,6 @@
     <w:p>
       <w:pPr>
         <w:pStyle w:val="NoSpacing"/>
-        <w:spacing w:line="480" w:lineRule="auto"/>
       </w:pPr>
       <w:r>
         <w:t xml:space="preserve">Type: </w:t>
@@ -28,7 +26,6 @@
     <w:p>
       <w:pPr>
         <w:pStyle w:val="NoSpacing"/>
-        <w:spacing w:line="480" w:lineRule="auto"/>
       </w:pPr>
       <w:r>
         <w:t>A) Two</w:t>
@@ -37,7 +34,6 @@
     <w:p>
       <w:pPr>
         <w:pStyle w:val="NoSpacing"/>
-        <w:spacing w:line="480" w:lineRule="auto"/>
       </w:pPr>
       <w:r>
         <w:t>B) Four</w:t>
@@ -46,7 +42,6 @@
     <w:p>
       <w:pPr>
         <w:pStyle w:val="NoSpacing"/>
-        <w:spacing w:line="480" w:lineRule="auto"/>
       </w:pPr>
       <w:r>
         <w:t>C) Five</w:t>
@@ -55,7 +50,6 @@
     <w:p>
       <w:pPr>
         <w:pStyle w:val="NoSpacing"/>
-        <w:spacing w:line="480" w:lineRule="auto"/>
       </w:pPr>
       <w:r>
         <w:t>D) Six</w:t>
@@ -64,7 +58,6 @@
     <w:p>
       <w:pPr>
         <w:pStyle w:val="NoSpacing"/>
-        <w:spacing w:line="480" w:lineRule="auto"/>
       </w:pPr>
       <w:r>
         <w:t>Answer: C</w:t>
@@ -73,7 +66,11 @@
     <w:p>
       <w:pPr>
         <w:pStyle w:val="NoSpacing"/>
-        <w:spacing w:line="480" w:lineRule="auto"/>
+      </w:pPr>
+    </w:p>
+    <w:p>
+      <w:pPr>
+        <w:pStyle w:val="NoSpacing"/>
       </w:pPr>
       <w:r>
         <w:t>Question: ______ language is the only language that a computer directly understands.</w:t>
@@ -82,7 +79,6 @@
     <w:p>
       <w:pPr>
         <w:pStyle w:val="NoSpacing"/>
-        <w:spacing w:line="480" w:lineRule="auto"/>
       </w:pPr>
       <w:r>
         <w:t>Type: fill</w:t>
@@ -91,7 +87,6 @@
     <w:p>
       <w:pPr>
         <w:pStyle w:val="NoSpacing"/>
-        <w:spacing w:line="480" w:lineRule="auto"/>
       </w:pPr>
       <w:r>
         <w:t>Answer: Machine</w:t>
@@ -100,7 +95,11 @@
     <w:p>
       <w:pPr>
         <w:pStyle w:val="NoSpacing"/>
-        <w:spacing w:line="480" w:lineRule="auto"/>
+      </w:pPr>
+    </w:p>
+    <w:p>
+      <w:pPr>
+        <w:pStyle w:val="NoSpacing"/>
       </w:pPr>
       <w:r>
         <w:t>Question: Unscramble the letters to form the name of a language processor.</w:t>
@@ -109,7 +108,6 @@
     <w:p>
       <w:pPr>
         <w:pStyle w:val="NoSpacing"/>
-        <w:spacing w:line="480" w:lineRule="auto"/>
       </w:pPr>
       <w:r>
         <w:t>Type: jumbled</w:t>
@@ -118,7 +116,6 @@
     <w:p>
       <w:pPr>
         <w:pStyle w:val="NoSpacing"/>
-        <w:spacing w:line="480" w:lineRule="auto"/>
       </w:pPr>
       <w:r>
         <w:t>Answer: compiler</w:t>
@@ -127,7 +124,11 @@
     <w:p>
       <w:pPr>
         <w:pStyle w:val="NoSpacing"/>
-        <w:spacing w:line="480" w:lineRule="auto"/>
+      </w:pPr>
+    </w:p>
+    <w:p>
+      <w:pPr>
+        <w:pStyle w:val="NoSpacing"/>
       </w:pPr>
       <w:r>
         <w:t>Question: Match the computer languages to their respective generation categories.</w:t>
@@ -136,7 +137,6 @@
     <w:p>
       <w:pPr>
         <w:pStyle w:val="NoSpacing"/>
-        <w:spacing w:line="480" w:lineRule="auto"/>
       </w:pPr>
       <w:r>
         <w:t>Type: match</w:t>
@@ -145,7 +145,6 @@
     <w:p>
       <w:pPr>
         <w:pStyle w:val="NoSpacing"/>
-        <w:spacing w:line="480" w:lineRule="auto"/>
       </w:pPr>
       <w:r>
         <w:t xml:space="preserve">Answer: </w:t>
@@ -154,7 +153,6 @@
     <w:p>
       <w:pPr>
         <w:pStyle w:val="NoSpacing"/>
-        <w:spacing w:line="480" w:lineRule="auto"/>
       </w:pPr>
       <w:r>
         <w:t xml:space="preserve">Machine </w:t>
@@ -171,7 +169,6 @@
     <w:p>
       <w:pPr>
         <w:pStyle w:val="NoSpacing"/>
-        <w:spacing w:line="480" w:lineRule="auto"/>
       </w:pPr>
       <w:r>
         <w:t xml:space="preserve">Assembly </w:t>
@@ -188,7 +185,6 @@
     <w:p>
       <w:pPr>
         <w:pStyle w:val="NoSpacing"/>
-        <w:spacing w:line="480" w:lineRule="auto"/>
       </w:pPr>
       <w:proofErr w:type="gramStart"/>
       <w:r>
@@ -202,7 +198,6 @@
     <w:p>
       <w:pPr>
         <w:pStyle w:val="NoSpacing"/>
-        <w:spacing w:line="480" w:lineRule="auto"/>
       </w:pPr>
       <w:proofErr w:type="gramStart"/>
       <w:r>
@@ -216,7 +211,6 @@
     <w:p>
       <w:pPr>
         <w:pStyle w:val="NoSpacing"/>
-        <w:spacing w:line="480" w:lineRule="auto"/>
       </w:pPr>
       <w:r>
         <w:t>OPS</w:t>
@@ -233,7 +227,11 @@
     <w:p>
       <w:pPr>
         <w:pStyle w:val="NoSpacing"/>
-        <w:spacing w:line="480" w:lineRule="auto"/>
+      </w:pPr>
+    </w:p>
+    <w:p>
+      <w:pPr>
+        <w:pStyle w:val="NoSpacing"/>
       </w:pPr>
       <w:r>
         <w:t>Question: The development of computer languages is classified into two categories.</w:t>
@@ -242,7 +240,6 @@
     <w:p>
       <w:pPr>
         <w:pStyle w:val="NoSpacing"/>
-        <w:spacing w:line="480" w:lineRule="auto"/>
       </w:pPr>
       <w:r>
         <w:t xml:space="preserve">Type: </w:t>
@@ -256,13 +253,16 @@
     <w:p>
       <w:pPr>
         <w:pStyle w:val="NoSpacing"/>
-        <w:spacing w:line="480" w:lineRule="auto"/>
       </w:pPr>
       <w:r>
         <w:t>Answer: false</w:t>
       </w:r>
     </w:p>
-    <w:p/>
+    <w:p>
+      <w:pPr>
+        <w:pStyle w:val="NoSpacing"/>
+      </w:pPr>
+    </w:p>
     <w:sectPr>
       <w:pgSz w:w="11906" w:h="16838"/>
       <w:pgMar w:top="1440" w:right="1440" w:bottom="1440" w:left="1440" w:header="708" w:footer="708" w:gutter="0"/>

</xml_diff>